<commit_message>
Switch architecture docs to PostgreSQL
</commit_message>
<xml_diff>
--- a/docs/technical/TRD_Personal_Brand_Platform_COMMERCE_READY.docx
+++ b/docs/technical/TRD_Personal_Brand_Platform_COMMERCE_READY.docx
@@ -25,7 +25,7 @@
           <w:color w:val="222222"/>
           <w:sz w:val="26"/>
         </w:rPr>
-        <w:t>Technical Requirements Document untuk Elixir + Supabase + Themeable Frontend</w:t>
+        <w:t>Technical Requirements Document untuk Elixir + PostgreSQL + Themeable Frontend</w:t>
       </w:r>
     </w:p>
     <w:p/>
@@ -245,7 +245,7 @@
         <w:rPr>
           <w:sz w:val="21"/>
         </w:rPr>
-        <w:t>Sistem dibangun sebagai aplikasi Phoenix/Elixir dengan Phoenix LiveView untuk public website dan admin dashboard. Supabase digunakan sebagai hosted Postgres dan storage. Theme system dibuat di layer presentation, sehingga data yang sama bisa dirender oleh banyak theme.</w:t>
+        <w:t>Sistem dibangun sebagai aplikasi Phoenix/Elixir dengan Phoenix LiveView untuk public website dan admin dashboard. PostgreSQL digunakan sebagai database utama dan media storage dikelola aplikasi. Theme system dibuat di layer presentation, sehingga data yang sama bisa dirender oleh banyak theme.</w:t>
       </w:r>
     </w:p>
     <w:p>
@@ -366,7 +366,7 @@
         <w:rPr>
           <w:sz w:val="21"/>
         </w:rPr>
-        <w:t>Supabase</w:t>
+        <w:t>PostgreSQL</w:t>
       </w:r>
     </w:p>
     <w:p>
@@ -1023,7 +1023,7 @@
         <w:rPr>
           <w:sz w:val="21"/>
         </w:rPr>
-        <w:t>Supabase</w:t>
+        <w:t>PostgreSQL</w:t>
       </w:r>
     </w:p>
     <w:p>
@@ -1045,7 +1045,7 @@
         <w:rPr>
           <w:sz w:val="21"/>
         </w:rPr>
-        <w:t xml:space="preserve">  Storage bucket for images/files</w:t>
+        <w:t xml:space="preserve">  App-owned media storage for images/files</w:t>
       </w:r>
     </w:p>
     <w:p>
@@ -1081,7 +1081,7 @@
         <w:rPr>
           <w:sz w:val="21"/>
         </w:rPr>
-        <w:t>Supabase Postgres diakses lewat Ecto.</w:t>
+        <w:t>PostgreSQL diakses lewat Ecto.</w:t>
       </w:r>
     </w:p>
     <w:p>
@@ -1093,7 +1093,7 @@
         <w:rPr>
           <w:sz w:val="21"/>
         </w:rPr>
-        <w:t>Supabase Storage dipakai untuk media upload.</w:t>
+        <w:t>local disk storage dipakai untuk media upload.</w:t>
       </w:r>
     </w:p>
     <w:p>
@@ -3598,7 +3598,7 @@
                 <w:color w:val="222222"/>
                 <w:sz w:val="18"/>
               </w:rPr>
-              <w:t>Admin upload file -&gt; Phoenix upload handler -&gt; Supabase Storage -&gt; save media URL/metadata.</w:t>
+              <w:t>Admin upload file -&gt; Phoenix upload handler -&gt; local disk storage -&gt; save media URL/metadata.</w:t>
             </w:r>
           </w:p>
         </w:tc>
@@ -4285,7 +4285,7 @@
                 <w:color w:val="222222"/>
                 <w:sz w:val="18"/>
               </w:rPr>
-              <w:t>Supabase Postgres.</w:t>
+              <w:t>PostgreSQL.</w:t>
             </w:r>
           </w:p>
         </w:tc>
@@ -4329,7 +4329,7 @@
                 <w:color w:val="222222"/>
                 <w:sz w:val="18"/>
               </w:rPr>
-              <w:t>Supabase Storage.</w:t>
+              <w:t>local disk storage.</w:t>
             </w:r>
           </w:p>
         </w:tc>
@@ -4461,7 +4461,7 @@
                 <w:color w:val="222222"/>
                 <w:sz w:val="18"/>
               </w:rPr>
-              <w:t>Supabase backup/export policy.</w:t>
+              <w:t>PostgreSQL backup/export policy.</w:t>
             </w:r>
           </w:p>
         </w:tc>
@@ -4500,7 +4500,7 @@
         <w:rPr>
           <w:sz w:val="21"/>
         </w:rPr>
-        <w:t>Setup Supabase Postgres connection via Ecto.</w:t>
+        <w:t>Setup PostgreSQL connection via Ecto.</w:t>
       </w:r>
     </w:p>
     <w:p>
@@ -4584,7 +4584,7 @@
         <w:rPr>
           <w:sz w:val="21"/>
         </w:rPr>
-        <w:t>Tambahkan upload media ke Supabase Storage.</w:t>
+        <w:t>Tambahkan upload media ke local disk storage.</w:t>
       </w:r>
     </w:p>
     <w:p>
@@ -4776,7 +4776,7 @@
                 <w:color w:val="222222"/>
                 <w:sz w:val="18"/>
               </w:rPr>
-              <w:t>Use Supabase as Postgres + Storage only</w:t>
+              <w:t>Use PostgreSQL directly, with local disk media storage for MVP</w:t>
             </w:r>
           </w:p>
         </w:tc>
@@ -4797,7 +4797,7 @@
                 <w:color w:val="222222"/>
                 <w:sz w:val="18"/>
               </w:rPr>
-              <w:t>Elixir tetap jadi pusat logic, Supabase sebagai infrastructure.</w:t>
+              <w:t>Elixir tetap jadi pusat logic, PostgreSQL sebagai infrastructure.</w:t>
             </w:r>
           </w:p>
         </w:tc>
@@ -5244,7 +5244,7 @@
               <w:rPr>
                 <w:b w:val="0"/>
               </w:rPr>
-              <w:t>Metadata file/gambar di Supabase Storage.</w:t>
+              <w:t>Metadata file/gambar di local disk storage.</w:t>
             </w:r>
           </w:p>
         </w:tc>
@@ -7169,7 +7169,7 @@
           <w:rFonts w:ascii="Courier New" w:hAnsi="Courier New" w:eastAsia="Courier New"/>
           <w:sz w:val="18"/>
         </w:rPr>
-        <w:t>If valid: persist to Supabase Postgres</w:t>
+        <w:t>If valid: persist to PostgreSQL</w:t>
         <w:br/>
       </w:r>
       <w:r>
@@ -7185,7 +7185,7 @@
           <w:rFonts w:ascii="Courier New" w:hAnsi="Courier New" w:eastAsia="Courier New"/>
           <w:sz w:val="18"/>
         </w:rPr>
-        <w:t>If media uploaded: store file in Supabase Storage and save metadata in media table</w:t>
+        <w:t>If media uploaded: store file in local disk storage and save metadata in media table</w:t>
         <w:br/>
       </w:r>
       <w:r>

</xml_diff>